<commit_message>
Add graduation report part 1 (EN and AR); update design to current versions
- Report part 1 in English and Arabic: problem and objectives, state of the
  art with verified sources, block diagram and flowchart, Chapter 1
  theoretical study
- System Design 1.2: Python 3.13, PostgreSQL 18, Redis 8, Garage instead of
  MinIO (archived April 2026), Unfold RTL status
- Builder: Arabic right-to-left layout, report covers, page totals per
  section, new-page chapters

Co-Authored-By: Claude Opus 5.5 <noreply@anthropic.com>
</commit_message>
<xml_diff>
--- a/docs/SPU-Dental-SRS.docx
+++ b/docs/SPU-Dental-SRS.docx
@@ -5,10 +5,9 @@
     <w:p/>
     <w:p/>
     <w:p/>
-    <w:p/>
-    <w:p/>
     <w:p>
       <w:pPr>
+        <w:spacing w:after="40"/>
         <w:jc w:val="center"/>
       </w:pPr>
       <w:r>
@@ -70,8 +69,6 @@
     <w:p/>
     <w:p/>
     <w:p/>
-    <w:p/>
-    <w:p/>
     <w:tbl>
       <w:tblPr>
         <w:tblW w:w="0" w:type="auto"/>
@@ -79,8 +76,8 @@
         <w:tblLook w:val="04A0" w:firstRow="1" w:lastRow="0" w:firstColumn="1" w:lastColumn="0" w:noHBand="0" w:noVBand="1"/>
       </w:tblPr>
       <w:tblGrid>
-        <w:gridCol w:w="2268"/>
-        <w:gridCol w:w="4535"/>
+        <w:gridCol w:w="2381"/>
+        <w:gridCol w:w="5102"/>
       </w:tblGrid>
       <w:tr>
         <w:trPr>
@@ -88,10 +85,11 @@
         </w:trPr>
         <w:tc>
           <w:tcPr>
-            <w:tcW w:w="2268" w:type="dxa"/>
-          </w:tcPr>
-          <w:p>
-            <w:pPr>
+            <w:tcW w:w="2381" w:type="dxa"/>
+          </w:tcPr>
+          <w:p>
+            <w:pPr>
+              <w:spacing w:after="60"/>
               <w:jc w:val="right"/>
             </w:pPr>
             <w:r>
@@ -105,9 +103,12 @@
         </w:tc>
         <w:tc>
           <w:tcPr>
-            <w:tcW w:w="4535" w:type="dxa"/>
-          </w:tcPr>
-          <w:p>
+            <w:tcW w:w="5102" w:type="dxa"/>
+          </w:tcPr>
+          <w:p>
+            <w:pPr>
+              <w:spacing w:after="60"/>
+            </w:pPr>
             <w:r>
               <w:t>Hamza Almawla, Zeannab Alhommsi</w:t>
             </w:r>
@@ -120,10 +121,11 @@
         </w:trPr>
         <w:tc>
           <w:tcPr>
-            <w:tcW w:w="2268" w:type="dxa"/>
-          </w:tcPr>
-          <w:p>
-            <w:pPr>
+            <w:tcW w:w="2381" w:type="dxa"/>
+          </w:tcPr>
+          <w:p>
+            <w:pPr>
+              <w:spacing w:after="60"/>
               <w:jc w:val="right"/>
             </w:pPr>
             <w:r>
@@ -137,9 +139,12 @@
         </w:tc>
         <w:tc>
           <w:tcPr>
-            <w:tcW w:w="4535" w:type="dxa"/>
-          </w:tcPr>
-          <w:p>
+            <w:tcW w:w="5102" w:type="dxa"/>
+          </w:tcPr>
+          <w:p>
+            <w:pPr>
+              <w:spacing w:after="60"/>
+            </w:pPr>
             <w:r>
               <w:t>Oct 28, 2026</w:t>
             </w:r>
@@ -152,10 +157,11 @@
         </w:trPr>
         <w:tc>
           <w:tcPr>
-            <w:tcW w:w="2268" w:type="dxa"/>
-          </w:tcPr>
-          <w:p>
-            <w:pPr>
+            <w:tcW w:w="2381" w:type="dxa"/>
+          </w:tcPr>
+          <w:p>
+            <w:pPr>
+              <w:spacing w:after="60"/>
               <w:jc w:val="right"/>
             </w:pPr>
             <w:r>
@@ -169,9 +175,12 @@
         </w:tc>
         <w:tc>
           <w:tcPr>
-            <w:tcW w:w="4535" w:type="dxa"/>
-          </w:tcPr>
-          <w:p>
+            <w:tcW w:w="5102" w:type="dxa"/>
+          </w:tcPr>
+          <w:p>
+            <w:pPr>
+              <w:spacing w:after="60"/>
+            </w:pPr>
             <w:r>
               <w:t>Draft for review</w:t>
             </w:r>
@@ -217,7 +226,7 @@
       <w:r>
         <w:fldChar w:fldCharType="separate"/>
       </w:r>
-      <w:hyperlink w:anchor="_Toc244092751" w:history="1">
+      <w:hyperlink w:anchor="_Toc244094628" w:history="1">
         <w:r>
           <w:rPr>
             <w:rStyle w:val="Hyperlink"/>
@@ -244,7 +253,7 @@
             <w:noProof/>
             <w:webHidden/>
           </w:rPr>
-          <w:instrText xml:space="preserve"> PAGEREF _Toc244092751 \h </w:instrText>
+          <w:instrText xml:space="preserve"> PAGEREF _Toc244094628 \h </w:instrText>
         </w:r>
         <w:r>
           <w:rPr>
@@ -285,7 +294,7 @@
           <w:noProof/>
         </w:rPr>
       </w:pPr>
-      <w:hyperlink w:anchor="_Toc244092752" w:history="1">
+      <w:hyperlink w:anchor="_Toc244094629" w:history="1">
         <w:r>
           <w:rPr>
             <w:rStyle w:val="Hyperlink"/>
@@ -312,7 +321,7 @@
             <w:noProof/>
             <w:webHidden/>
           </w:rPr>
-          <w:instrText xml:space="preserve"> PAGEREF _Toc244092752 \h </w:instrText>
+          <w:instrText xml:space="preserve"> PAGEREF _Toc244094629 \h </w:instrText>
         </w:r>
         <w:r>
           <w:rPr>
@@ -353,7 +362,7 @@
           <w:noProof/>
         </w:rPr>
       </w:pPr>
-      <w:hyperlink w:anchor="_Toc244092753" w:history="1">
+      <w:hyperlink w:anchor="_Toc244094630" w:history="1">
         <w:r>
           <w:rPr>
             <w:rStyle w:val="Hyperlink"/>
@@ -380,7 +389,7 @@
             <w:noProof/>
             <w:webHidden/>
           </w:rPr>
-          <w:instrText xml:space="preserve"> PAGEREF _Toc244092753 \h </w:instrText>
+          <w:instrText xml:space="preserve"> PAGEREF _Toc244094630 \h </w:instrText>
         </w:r>
         <w:r>
           <w:rPr>
@@ -421,7 +430,7 @@
           <w:noProof/>
         </w:rPr>
       </w:pPr>
-      <w:hyperlink w:anchor="_Toc244092754" w:history="1">
+      <w:hyperlink w:anchor="_Toc244094631" w:history="1">
         <w:r>
           <w:rPr>
             <w:rStyle w:val="Hyperlink"/>
@@ -448,7 +457,7 @@
             <w:noProof/>
             <w:webHidden/>
           </w:rPr>
-          <w:instrText xml:space="preserve"> PAGEREF _Toc244092754 \h </w:instrText>
+          <w:instrText xml:space="preserve"> PAGEREF _Toc244094631 \h </w:instrText>
         </w:r>
         <w:r>
           <w:rPr>
@@ -489,7 +498,7 @@
           <w:noProof/>
         </w:rPr>
       </w:pPr>
-      <w:hyperlink w:anchor="_Toc244092755" w:history="1">
+      <w:hyperlink w:anchor="_Toc244094632" w:history="1">
         <w:r>
           <w:rPr>
             <w:rStyle w:val="Hyperlink"/>
@@ -516,7 +525,7 @@
             <w:noProof/>
             <w:webHidden/>
           </w:rPr>
-          <w:instrText xml:space="preserve"> PAGEREF _Toc244092755 \h </w:instrText>
+          <w:instrText xml:space="preserve"> PAGEREF _Toc244094632 \h </w:instrText>
         </w:r>
         <w:r>
           <w:rPr>
@@ -557,7 +566,7 @@
           <w:noProof/>
         </w:rPr>
       </w:pPr>
-      <w:hyperlink w:anchor="_Toc244092756" w:history="1">
+      <w:hyperlink w:anchor="_Toc244094633" w:history="1">
         <w:r>
           <w:rPr>
             <w:rStyle w:val="Hyperlink"/>
@@ -584,7 +593,7 @@
             <w:noProof/>
             <w:webHidden/>
           </w:rPr>
-          <w:instrText xml:space="preserve"> PAGEREF _Toc244092756 \h </w:instrText>
+          <w:instrText xml:space="preserve"> PAGEREF _Toc244094633 \h </w:instrText>
         </w:r>
         <w:r>
           <w:rPr>
@@ -625,7 +634,7 @@
           <w:noProof/>
         </w:rPr>
       </w:pPr>
-      <w:hyperlink w:anchor="_Toc244092757" w:history="1">
+      <w:hyperlink w:anchor="_Toc244094634" w:history="1">
         <w:r>
           <w:rPr>
             <w:rStyle w:val="Hyperlink"/>
@@ -652,7 +661,7 @@
             <w:noProof/>
             <w:webHidden/>
           </w:rPr>
-          <w:instrText xml:space="preserve"> PAGEREF _Toc244092757 \h </w:instrText>
+          <w:instrText xml:space="preserve"> PAGEREF _Toc244094634 \h </w:instrText>
         </w:r>
         <w:r>
           <w:rPr>
@@ -693,7 +702,7 @@
           <w:noProof/>
         </w:rPr>
       </w:pPr>
-      <w:hyperlink w:anchor="_Toc244092758" w:history="1">
+      <w:hyperlink w:anchor="_Toc244094635" w:history="1">
         <w:r>
           <w:rPr>
             <w:rStyle w:val="Hyperlink"/>
@@ -720,7 +729,7 @@
             <w:noProof/>
             <w:webHidden/>
           </w:rPr>
-          <w:instrText xml:space="preserve"> PAGEREF _Toc244092758 \h </w:instrText>
+          <w:instrText xml:space="preserve"> PAGEREF _Toc244094635 \h </w:instrText>
         </w:r>
         <w:r>
           <w:rPr>
@@ -761,7 +770,7 @@
           <w:noProof/>
         </w:rPr>
       </w:pPr>
-      <w:hyperlink w:anchor="_Toc244092759" w:history="1">
+      <w:hyperlink w:anchor="_Toc244094636" w:history="1">
         <w:r>
           <w:rPr>
             <w:rStyle w:val="Hyperlink"/>
@@ -788,7 +797,7 @@
             <w:noProof/>
             <w:webHidden/>
           </w:rPr>
-          <w:instrText xml:space="preserve"> PAGEREF _Toc244092759 \h </w:instrText>
+          <w:instrText xml:space="preserve"> PAGEREF _Toc244094636 \h </w:instrText>
         </w:r>
         <w:r>
           <w:rPr>
@@ -829,7 +838,7 @@
           <w:noProof/>
         </w:rPr>
       </w:pPr>
-      <w:hyperlink w:anchor="_Toc244092760" w:history="1">
+      <w:hyperlink w:anchor="_Toc244094637" w:history="1">
         <w:r>
           <w:rPr>
             <w:rStyle w:val="Hyperlink"/>
@@ -856,7 +865,7 @@
             <w:noProof/>
             <w:webHidden/>
           </w:rPr>
-          <w:instrText xml:space="preserve"> PAGEREF _Toc244092760 \h </w:instrText>
+          <w:instrText xml:space="preserve"> PAGEREF _Toc244094637 \h </w:instrText>
         </w:r>
         <w:r>
           <w:rPr>
@@ -897,7 +906,7 @@
           <w:noProof/>
         </w:rPr>
       </w:pPr>
-      <w:hyperlink w:anchor="_Toc244092761" w:history="1">
+      <w:hyperlink w:anchor="_Toc244094638" w:history="1">
         <w:r>
           <w:rPr>
             <w:rStyle w:val="Hyperlink"/>
@@ -924,7 +933,7 @@
             <w:noProof/>
             <w:webHidden/>
           </w:rPr>
-          <w:instrText xml:space="preserve"> PAGEREF _Toc244092761 \h </w:instrText>
+          <w:instrText xml:space="preserve"> PAGEREF _Toc244094638 \h </w:instrText>
         </w:r>
         <w:r>
           <w:rPr>
@@ -965,7 +974,7 @@
           <w:noProof/>
         </w:rPr>
       </w:pPr>
-      <w:hyperlink w:anchor="_Toc244092762" w:history="1">
+      <w:hyperlink w:anchor="_Toc244094639" w:history="1">
         <w:r>
           <w:rPr>
             <w:rStyle w:val="Hyperlink"/>
@@ -992,7 +1001,7 @@
             <w:noProof/>
             <w:webHidden/>
           </w:rPr>
-          <w:instrText xml:space="preserve"> PAGEREF _Toc244092762 \h </w:instrText>
+          <w:instrText xml:space="preserve"> PAGEREF _Toc244094639 \h </w:instrText>
         </w:r>
         <w:r>
           <w:rPr>
@@ -1033,7 +1042,7 @@
           <w:noProof/>
         </w:rPr>
       </w:pPr>
-      <w:hyperlink w:anchor="_Toc244092763" w:history="1">
+      <w:hyperlink w:anchor="_Toc244094640" w:history="1">
         <w:r>
           <w:rPr>
             <w:rStyle w:val="Hyperlink"/>
@@ -1060,7 +1069,7 @@
             <w:noProof/>
             <w:webHidden/>
           </w:rPr>
-          <w:instrText xml:space="preserve"> PAGEREF _Toc244092763 \h </w:instrText>
+          <w:instrText xml:space="preserve"> PAGEREF _Toc244094640 \h </w:instrText>
         </w:r>
         <w:r>
           <w:rPr>
@@ -1101,7 +1110,7 @@
           <w:noProof/>
         </w:rPr>
       </w:pPr>
-      <w:hyperlink w:anchor="_Toc244092764" w:history="1">
+      <w:hyperlink w:anchor="_Toc244094641" w:history="1">
         <w:r>
           <w:rPr>
             <w:rStyle w:val="Hyperlink"/>
@@ -1128,7 +1137,7 @@
             <w:noProof/>
             <w:webHidden/>
           </w:rPr>
-          <w:instrText xml:space="preserve"> PAGEREF _Toc244092764 \h </w:instrText>
+          <w:instrText xml:space="preserve"> PAGEREF _Toc244094641 \h </w:instrText>
         </w:r>
         <w:r>
           <w:rPr>
@@ -1169,7 +1178,7 @@
           <w:noProof/>
         </w:rPr>
       </w:pPr>
-      <w:hyperlink w:anchor="_Toc244092765" w:history="1">
+      <w:hyperlink w:anchor="_Toc244094642" w:history="1">
         <w:r>
           <w:rPr>
             <w:rStyle w:val="Hyperlink"/>
@@ -1196,7 +1205,7 @@
             <w:noProof/>
             <w:webHidden/>
           </w:rPr>
-          <w:instrText xml:space="preserve"> PAGEREF _Toc244092765 \h </w:instrText>
+          <w:instrText xml:space="preserve"> PAGEREF _Toc244094642 \h </w:instrText>
         </w:r>
         <w:r>
           <w:rPr>
@@ -1237,7 +1246,7 @@
           <w:noProof/>
         </w:rPr>
       </w:pPr>
-      <w:hyperlink w:anchor="_Toc244092766" w:history="1">
+      <w:hyperlink w:anchor="_Toc244094643" w:history="1">
         <w:r>
           <w:rPr>
             <w:rStyle w:val="Hyperlink"/>
@@ -1264,7 +1273,7 @@
             <w:noProof/>
             <w:webHidden/>
           </w:rPr>
-          <w:instrText xml:space="preserve"> PAGEREF _Toc244092766 \h </w:instrText>
+          <w:instrText xml:space="preserve"> PAGEREF _Toc244094643 \h </w:instrText>
         </w:r>
         <w:r>
           <w:rPr>
@@ -1305,7 +1314,7 @@
           <w:noProof/>
         </w:rPr>
       </w:pPr>
-      <w:hyperlink w:anchor="_Toc244092767" w:history="1">
+      <w:hyperlink w:anchor="_Toc244094644" w:history="1">
         <w:r>
           <w:rPr>
             <w:rStyle w:val="Hyperlink"/>
@@ -1332,7 +1341,7 @@
             <w:noProof/>
             <w:webHidden/>
           </w:rPr>
-          <w:instrText xml:space="preserve"> PAGEREF _Toc244092767 \h </w:instrText>
+          <w:instrText xml:space="preserve"> PAGEREF _Toc244094644 \h </w:instrText>
         </w:r>
         <w:r>
           <w:rPr>
@@ -1373,7 +1382,7 @@
           <w:noProof/>
         </w:rPr>
       </w:pPr>
-      <w:hyperlink w:anchor="_Toc244092768" w:history="1">
+      <w:hyperlink w:anchor="_Toc244094645" w:history="1">
         <w:r>
           <w:rPr>
             <w:rStyle w:val="Hyperlink"/>
@@ -1400,7 +1409,7 @@
             <w:noProof/>
             <w:webHidden/>
           </w:rPr>
-          <w:instrText xml:space="preserve"> PAGEREF _Toc244092768 \h </w:instrText>
+          <w:instrText xml:space="preserve"> PAGEREF _Toc244094645 \h </w:instrText>
         </w:r>
         <w:r>
           <w:rPr>
@@ -1441,7 +1450,7 @@
           <w:noProof/>
         </w:rPr>
       </w:pPr>
-      <w:hyperlink w:anchor="_Toc244092769" w:history="1">
+      <w:hyperlink w:anchor="_Toc244094646" w:history="1">
         <w:r>
           <w:rPr>
             <w:rStyle w:val="Hyperlink"/>
@@ -1468,7 +1477,7 @@
             <w:noProof/>
             <w:webHidden/>
           </w:rPr>
-          <w:instrText xml:space="preserve"> PAGEREF _Toc244092769 \h </w:instrText>
+          <w:instrText xml:space="preserve"> PAGEREF _Toc244094646 \h </w:instrText>
         </w:r>
         <w:r>
           <w:rPr>
@@ -1509,7 +1518,7 @@
           <w:noProof/>
         </w:rPr>
       </w:pPr>
-      <w:hyperlink w:anchor="_Toc244092770" w:history="1">
+      <w:hyperlink w:anchor="_Toc244094647" w:history="1">
         <w:r>
           <w:rPr>
             <w:rStyle w:val="Hyperlink"/>
@@ -1536,7 +1545,7 @@
             <w:noProof/>
             <w:webHidden/>
           </w:rPr>
-          <w:instrText xml:space="preserve"> PAGEREF _Toc244092770 \h </w:instrText>
+          <w:instrText xml:space="preserve"> PAGEREF _Toc244094647 \h </w:instrText>
         </w:r>
         <w:r>
           <w:rPr>
@@ -1827,7 +1836,7 @@
       <w:pPr>
         <w:pStyle w:val="Heading1"/>
       </w:pPr>
-      <w:bookmarkStart w:id="0" w:name="_Toc244092751"/>
+      <w:bookmarkStart w:id="0" w:name="_Toc244094628"/>
       <w:r>
         <w:t>1. Introduction</w:t>
       </w:r>
@@ -2661,7 +2670,7 @@
       <w:pPr>
         <w:pStyle w:val="Heading1"/>
       </w:pPr>
-      <w:bookmarkStart w:id="1" w:name="_Toc244092752"/>
+      <w:bookmarkStart w:id="1" w:name="_Toc244094629"/>
       <w:r>
         <w:t>2. Overall description</w:t>
       </w:r>
@@ -3548,7 +3557,7 @@
       <w:pPr>
         <w:pStyle w:val="Heading1"/>
       </w:pPr>
-      <w:bookmarkStart w:id="2" w:name="_Toc244092753"/>
+      <w:bookmarkStart w:id="2" w:name="_Toc244094630"/>
       <w:r>
         <w:t>3. Roles and permissions</w:t>
       </w:r>
@@ -3556,10 +3565,10 @@
     </w:p>
     <w:p>
       <w:r>
-        <w:t>The server checks every action against the user's role and, for students</w:t>
+        <w:t xml:space="preserve">The server checks every action against the user's role and, for </w:t>
       </w:r>
       <w:r>
-        <w:t>, against ownership. A student only ever sees patients and cases assigned to them.</w:t>
+        <w:t>students, against ownership. A student only ever sees patients and cases assigned to them.</w:t>
       </w:r>
     </w:p>
     <w:p>
@@ -3601,7 +3610,10 @@
         <w:t>details</w:t>
       </w:r>
       <w:r>
-        <w:t xml:space="preserve"> personal and contact details only, no clinical data · — not allowed</w:t>
+        <w:t xml:space="preserve"> personal and contact details onl</w:t>
+      </w:r>
+      <w:r>
+        <w:t>y, no clinical data · — not allowed</w:t>
       </w:r>
     </w:p>
     <w:tbl>
@@ -4041,7 +4053,13 @@
               <w:rPr>
                 <w:sz w:val="18"/>
               </w:rPr>
-              <w:t>Register and edit patients</w:t>
+              <w:t xml:space="preserve">Register and edit </w:t>
+            </w:r>
+            <w:r>
+              <w:rPr>
+                <w:sz w:val="18"/>
+              </w:rPr>
+              <w:t>patients</w:t>
             </w:r>
           </w:p>
         </w:tc>
@@ -4646,7 +4664,13 @@
               <w:rPr>
                 <w:sz w:val="18"/>
               </w:rPr>
-              <w:t>Approve or return a diagnosis</w:t>
+              <w:t xml:space="preserve">Approve or </w:t>
+            </w:r>
+            <w:r>
+              <w:rPr>
+                <w:sz w:val="18"/>
+              </w:rPr>
+              <w:t>return a diagnosis</w:t>
             </w:r>
           </w:p>
         </w:tc>
@@ -5256,13 +5280,7 @@
               <w:rPr>
                 <w:sz w:val="18"/>
               </w:rPr>
-              <w:t xml:space="preserve">Approve, grade or </w:t>
-            </w:r>
-            <w:r>
-              <w:rPr>
-                <w:sz w:val="18"/>
-              </w:rPr>
-              <w:t>return a step</w:t>
+              <w:t>Approve, grade or return a step</w:t>
             </w:r>
           </w:p>
         </w:tc>
@@ -5991,7 +6009,13 @@
               <w:rPr>
                 <w:sz w:val="18"/>
               </w:rPr>
-              <w:t>Work and close a ticket; set a chair in or out of service</w:t>
+              <w:t xml:space="preserve">Work and close a </w:t>
+            </w:r>
+            <w:r>
+              <w:rPr>
+                <w:sz w:val="18"/>
+              </w:rPr>
+              <w:t>ticket; set a chair in or out of service</w:t>
             </w:r>
           </w:p>
         </w:tc>
@@ -6354,7 +6378,7 @@
       <w:pPr>
         <w:pStyle w:val="Heading1"/>
       </w:pPr>
-      <w:bookmarkStart w:id="3" w:name="_Toc244092754"/>
+      <w:bookmarkStart w:id="3" w:name="_Toc244094631"/>
       <w:r>
         <w:t>4. Dynamic configuration</w:t>
       </w:r>
@@ -7620,7 +7644,7 @@
       <w:pPr>
         <w:pStyle w:val="Heading1"/>
       </w:pPr>
-      <w:bookmarkStart w:id="4" w:name="_Toc244092755"/>
+      <w:bookmarkStart w:id="4" w:name="_Toc244094632"/>
       <w:r>
         <w:t>5. Functional requirements</w:t>
       </w:r>
@@ -7673,7 +7697,7 @@
       <w:pPr>
         <w:pStyle w:val="Heading2"/>
       </w:pPr>
-      <w:bookmarkStart w:id="5" w:name="_Toc244092756"/>
+      <w:bookmarkStart w:id="5" w:name="_Toc244094633"/>
       <w:r>
         <w:t>5.1 Web dashboard (super admin, reception, supervisors and management)</w:t>
       </w:r>
@@ -9001,7 +9025,7 @@
       <w:pPr>
         <w:pStyle w:val="Heading2"/>
       </w:pPr>
-      <w:bookmarkStart w:id="6" w:name="_Toc244092757"/>
+      <w:bookmarkStart w:id="6" w:name="_Toc244094634"/>
       <w:r>
         <w:t>5.2 Student interface (mobile)</w:t>
       </w:r>
@@ -9978,7 +10002,7 @@
       <w:pPr>
         <w:pStyle w:val="Heading2"/>
       </w:pPr>
-      <w:bookmarkStart w:id="7" w:name="_Toc244092758"/>
+      <w:bookmarkStart w:id="7" w:name="_Toc244094635"/>
       <w:r>
         <w:t xml:space="preserve">5.3 </w:t>
       </w:r>
@@ -10903,7 +10927,7 @@
       <w:pPr>
         <w:pStyle w:val="Heading2"/>
       </w:pPr>
-      <w:bookmarkStart w:id="8" w:name="_Toc244092759"/>
+      <w:bookmarkStart w:id="8" w:name="_Toc244094636"/>
       <w:r>
         <w:t>5.4 Maintenance interface (mobile)</w:t>
       </w:r>
@@ -11523,7 +11547,7 @@
       <w:pPr>
         <w:pStyle w:val="Heading2"/>
       </w:pPr>
-      <w:bookmarkStart w:id="9" w:name="_Toc244092760"/>
+      <w:bookmarkStart w:id="9" w:name="_Toc244094637"/>
       <w:r>
         <w:t>5.5 System-wide</w:t>
       </w:r>
@@ -12199,7 +12223,7 @@
       <w:pPr>
         <w:pStyle w:val="Heading1"/>
       </w:pPr>
-      <w:bookmarkStart w:id="10" w:name="_Toc244092761"/>
+      <w:bookmarkStart w:id="10" w:name="_Toc244094638"/>
       <w:r>
         <w:t>6. Business rules and record lifecycles</w:t>
       </w:r>
@@ -12222,7 +12246,7 @@
         </w:rPr>
         <w:lastRenderedPageBreak/>
         <w:drawing>
-          <wp:inline distT="0" distB="0" distL="0" distR="0" wp14:anchorId="39975A02" wp14:editId="7E64D9B0">
+          <wp:inline distT="0" distB="0" distL="0" distR="0" wp14:anchorId="1EF87842" wp14:editId="3D2A4C00">
             <wp:extent cx="5904230" cy="3365963"/>
             <wp:effectExtent l="0" t="0" r="0" b="0"/>
             <wp:docPr id="1" name="Picture 1"/>
@@ -12289,7 +12313,7 @@
       <w:pPr>
         <w:pStyle w:val="Heading2"/>
       </w:pPr>
-      <w:bookmarkStart w:id="11" w:name="_Toc244092762"/>
+      <w:bookmarkStart w:id="11" w:name="_Toc244094639"/>
       <w:r>
         <w:t>Business rules</w:t>
       </w:r>
@@ -12972,7 +12996,7 @@
       <w:pPr>
         <w:pStyle w:val="Heading1"/>
       </w:pPr>
-      <w:bookmarkStart w:id="12" w:name="_Toc244092763"/>
+      <w:bookmarkStart w:id="12" w:name="_Toc244094640"/>
       <w:r>
         <w:t>7. User stories and acceptance criteria</w:t>
       </w:r>
@@ -12990,7 +13014,7 @@
       <w:pPr>
         <w:pStyle w:val="Heading2"/>
       </w:pPr>
-      <w:bookmarkStart w:id="13" w:name="_Toc244092764"/>
+      <w:bookmarkStart w:id="13" w:name="_Toc244094641"/>
       <w:r>
         <w:t>7.1 Foundation</w:t>
       </w:r>
@@ -13450,7 +13474,7 @@
       <w:pPr>
         <w:pStyle w:val="Heading2"/>
       </w:pPr>
-      <w:bookmarkStart w:id="14" w:name="_Toc244092765"/>
+      <w:bookmarkStart w:id="14" w:name="_Toc244094642"/>
       <w:r>
         <w:lastRenderedPageBreak/>
         <w:t>7.2 Labs</w:t>
@@ -13905,7 +13929,7 @@
       <w:pPr>
         <w:pStyle w:val="Heading2"/>
       </w:pPr>
-      <w:bookmarkStart w:id="15" w:name="_Toc244092766"/>
+      <w:bookmarkStart w:id="15" w:name="_Toc244094643"/>
       <w:r>
         <w:t>7.3 Patients and diagnosis</w:t>
       </w:r>
@@ -14523,7 +14547,7 @@
       <w:pPr>
         <w:pStyle w:val="Heading2"/>
       </w:pPr>
-      <w:bookmarkStart w:id="16" w:name="_Toc244092767"/>
+      <w:bookmarkStart w:id="16" w:name="_Toc244094644"/>
       <w:r>
         <w:t>7.4 Clinical cards and maintenance</w:t>
       </w:r>
@@ -15221,7 +15245,7 @@
       <w:pPr>
         <w:pStyle w:val="Heading2"/>
       </w:pPr>
-      <w:bookmarkStart w:id="17" w:name="_Toc244092768"/>
+      <w:bookmarkStart w:id="17" w:name="_Toc244094645"/>
       <w:r>
         <w:t>7.5 Reports and notifications</w:t>
       </w:r>
@@ -15585,7 +15609,7 @@
       <w:pPr>
         <w:pStyle w:val="Heading1"/>
       </w:pPr>
-      <w:bookmarkStart w:id="18" w:name="_Toc244092769"/>
+      <w:bookmarkStart w:id="18" w:name="_Toc244094646"/>
       <w:r>
         <w:lastRenderedPageBreak/>
         <w:t>8. Non-functional requirements</w:t>
@@ -15594,10 +15618,10 @@
     </w:p>
     <w:p>
       <w:r>
-        <w:t xml:space="preserve">Each requirement has a number that can be </w:t>
+        <w:t xml:space="preserve">Each requirement has a number that can be tested. </w:t>
       </w:r>
       <w:r>
-        <w:t>tested. Privacy and audit are mandatory because the system holds medical records.</w:t>
+        <w:t>Privacy and audit are mandatory because the system holds medical records.</w:t>
       </w:r>
     </w:p>
     <w:tbl>
@@ -16516,7 +16540,7 @@
       <w:pPr>
         <w:pStyle w:val="Heading1"/>
       </w:pPr>
-      <w:bookmarkStart w:id="19" w:name="_Toc244092770"/>
+      <w:bookmarkStart w:id="19" w:name="_Toc244094647"/>
       <w:r>
         <w:t>9. External interfaces</w:t>
       </w:r>
@@ -16712,7 +16736,7 @@
                 <w:color w:val="262626"/>
                 <w:sz w:val="16"/>
               </w:rPr>
-              <w:t>{code, message, details}</w:t>
+              <w:t>{code, message, details}</w:t>
             </w:r>
             <w:r>
               <w:rPr>
@@ -17172,7 +17196,7 @@
         <w:color w:val="595959"/>
         <w:sz w:val="18"/>
       </w:rPr>
-      <w:instrText>NUMPAGES</w:instrText>
+      <w:instrText>SECTIONPAGES</w:instrText>
     </w:r>
     <w:r>
       <w:rPr>
@@ -17183,10 +17207,11 @@
     </w:r>
     <w:r>
       <w:rPr>
+        <w:noProof/>
         <w:color w:val="595959"/>
         <w:sz w:val="18"/>
       </w:rPr>
-      <w:t>1</w:t>
+      <w:t>15</w:t>
     </w:r>
     <w:r>
       <w:rPr>
@@ -28844,7 +28869,7 @@
     <w:autoRedefine/>
     <w:uiPriority w:val="39"/>
     <w:unhideWhenUsed/>
-    <w:rsid w:val="00C76C2B"/>
+    <w:rsid w:val="007B4ADA"/>
     <w:pPr>
       <w:spacing w:after="100"/>
     </w:pPr>
@@ -28856,7 +28881,7 @@
     <w:autoRedefine/>
     <w:uiPriority w:val="39"/>
     <w:unhideWhenUsed/>
-    <w:rsid w:val="00C76C2B"/>
+    <w:rsid w:val="007B4ADA"/>
     <w:pPr>
       <w:spacing w:after="100"/>
       <w:ind w:left="220"/>
@@ -28867,7 +28892,7 @@
     <w:basedOn w:val="DefaultParagraphFont"/>
     <w:uiPriority w:val="99"/>
     <w:unhideWhenUsed/>
-    <w:rsid w:val="00C76C2B"/>
+    <w:rsid w:val="007B4ADA"/>
     <w:rPr>
       <w:color w:val="0000FF" w:themeColor="hyperlink"/>
       <w:u w:val="single"/>

</xml_diff>